<commit_message>
docs: add day02 user, group, adn process v2
</commit_message>
<xml_diff>
--- a/day02/Module 1, Lesson 1.2.docx
+++ b/day02/Module 1, Lesson 1.2.docx
@@ -63,12 +63,6 @@
         <w:gridCol w:w="7038"/>
       </w:tblGrid>
       <w:tr>
-        <w:tblPrEx>
-          <w:tblCellMar>
-            <w:top w:w="0" w:type="dxa"/>
-            <w:bottom w:w="0" w:type="dxa"/>
-          </w:tblCellMar>
-        </w:tblPrEx>
         <w:tc>
           <w:tcPr>
             <w:tcW w:w="2600" w:type="dxa"/>
@@ -136,7 +130,7 @@
                 <w:noProof/>
                 <w:color w:val="7F7F7F"/>
               </w:rPr>
-              <w:t>10/29/2026</w:t>
+              <w:t>11/1/2026</w:t>
             </w:r>
             <w:r>
               <w:rPr>
@@ -148,12 +142,6 @@
         </w:tc>
       </w:tr>
       <w:tr>
-        <w:tblPrEx>
-          <w:tblCellMar>
-            <w:top w:w="0" w:type="dxa"/>
-            <w:bottom w:w="0" w:type="dxa"/>
-          </w:tblCellMar>
-        </w:tblPrEx>
         <w:tc>
           <w:tcPr>
             <w:tcW w:w="2600" w:type="dxa"/>
@@ -208,12 +196,6 @@
         </w:tc>
       </w:tr>
       <w:tr>
-        <w:tblPrEx>
-          <w:tblCellMar>
-            <w:top w:w="0" w:type="dxa"/>
-            <w:bottom w:w="0" w:type="dxa"/>
-          </w:tblCellMar>
-        </w:tblPrEx>
         <w:tc>
           <w:tcPr>
             <w:tcW w:w="2600" w:type="dxa"/>
@@ -268,12 +250,6 @@
         </w:tc>
       </w:tr>
       <w:tr>
-        <w:tblPrEx>
-          <w:tblCellMar>
-            <w:top w:w="0" w:type="dxa"/>
-            <w:bottom w:w="0" w:type="dxa"/>
-          </w:tblCellMar>
-        </w:tblPrEx>
         <w:tc>
           <w:tcPr>
             <w:tcW w:w="2600" w:type="dxa"/>
@@ -328,12 +304,6 @@
         </w:tc>
       </w:tr>
       <w:tr>
-        <w:tblPrEx>
-          <w:tblCellMar>
-            <w:top w:w="0" w:type="dxa"/>
-            <w:bottom w:w="0" w:type="dxa"/>
-          </w:tblCellMar>
-        </w:tblPrEx>
         <w:tc>
           <w:tcPr>
             <w:tcW w:w="2600" w:type="dxa"/>
@@ -388,12 +358,6 @@
         </w:tc>
       </w:tr>
       <w:tr>
-        <w:tblPrEx>
-          <w:tblCellMar>
-            <w:top w:w="0" w:type="dxa"/>
-            <w:bottom w:w="0" w:type="dxa"/>
-          </w:tblCellMar>
-        </w:tblPrEx>
         <w:tc>
           <w:tcPr>
             <w:tcW w:w="2600" w:type="dxa"/>
@@ -448,12 +412,6 @@
         </w:tc>
       </w:tr>
       <w:tr>
-        <w:tblPrEx>
-          <w:tblCellMar>
-            <w:top w:w="0" w:type="dxa"/>
-            <w:bottom w:w="0" w:type="dxa"/>
-          </w:tblCellMar>
-        </w:tblPrEx>
         <w:tc>
           <w:tcPr>
             <w:tcW w:w="2600" w:type="dxa"/>
@@ -538,10 +496,7 @@
       </w:pPr>
       <w:proofErr w:type="gramStart"/>
       <w:r>
-        <w:t>☐</w:t>
-      </w:r>
-      <w:r>
-        <w:t xml:space="preserve">  </w:t>
+        <w:t xml:space="preserve">☐  </w:t>
       </w:r>
       <w:r>
         <w:t>Users</w:t>
@@ -569,10 +524,7 @@
       </w:pPr>
       <w:proofErr w:type="gramStart"/>
       <w:r>
-        <w:t>☐</w:t>
-      </w:r>
-      <w:r>
-        <w:t xml:space="preserve">  Objective</w:t>
+        <w:t>☐  Objective</w:t>
       </w:r>
       <w:proofErr w:type="gramEnd"/>
       <w:r>
@@ -585,10 +537,7 @@
       </w:pPr>
       <w:proofErr w:type="gramStart"/>
       <w:r>
-        <w:t>☐</w:t>
-      </w:r>
-      <w:r>
-        <w:t xml:space="preserve">  Objective</w:t>
+        <w:t>☐  Objective</w:t>
       </w:r>
       <w:proofErr w:type="gramEnd"/>
       <w:r>
@@ -1477,12 +1426,6 @@
         <w:gridCol w:w="3638"/>
       </w:tblGrid>
       <w:tr>
-        <w:tblPrEx>
-          <w:tblCellMar>
-            <w:top w:w="0" w:type="dxa"/>
-            <w:bottom w:w="0" w:type="dxa"/>
-          </w:tblCellMar>
-        </w:tblPrEx>
         <w:trPr>
           <w:tblHeader/>
         </w:trPr>
@@ -1572,12 +1515,6 @@
         </w:tc>
       </w:tr>
       <w:tr>
-        <w:tblPrEx>
-          <w:tblCellMar>
-            <w:top w:w="0" w:type="dxa"/>
-            <w:bottom w:w="0" w:type="dxa"/>
-          </w:tblCellMar>
-        </w:tblPrEx>
         <w:tc>
           <w:tcPr>
             <w:tcW w:w="2965" w:type="dxa"/>
@@ -1650,12 +1587,6 @@
         </w:tc>
       </w:tr>
       <w:tr>
-        <w:tblPrEx>
-          <w:tblCellMar>
-            <w:top w:w="0" w:type="dxa"/>
-            <w:bottom w:w="0" w:type="dxa"/>
-          </w:tblCellMar>
-        </w:tblPrEx>
         <w:tc>
           <w:tcPr>
             <w:tcW w:w="2965" w:type="dxa"/>
@@ -1721,12 +1652,6 @@
         </w:tc>
       </w:tr>
       <w:tr>
-        <w:tblPrEx>
-          <w:tblCellMar>
-            <w:top w:w="0" w:type="dxa"/>
-            <w:bottom w:w="0" w:type="dxa"/>
-          </w:tblCellMar>
-        </w:tblPrEx>
         <w:tc>
           <w:tcPr>
             <w:tcW w:w="2965" w:type="dxa"/>
@@ -1791,12 +1716,6 @@
         </w:tc>
       </w:tr>
       <w:tr>
-        <w:tblPrEx>
-          <w:tblCellMar>
-            <w:top w:w="0" w:type="dxa"/>
-            <w:bottom w:w="0" w:type="dxa"/>
-          </w:tblCellMar>
-        </w:tblPrEx>
         <w:tc>
           <w:tcPr>
             <w:tcW w:w="2965" w:type="dxa"/>
@@ -1861,12 +1780,6 @@
         </w:tc>
       </w:tr>
       <w:tr>
-        <w:tblPrEx>
-          <w:tblCellMar>
-            <w:top w:w="0" w:type="dxa"/>
-            <w:bottom w:w="0" w:type="dxa"/>
-          </w:tblCellMar>
-        </w:tblPrEx>
         <w:tc>
           <w:tcPr>
             <w:tcW w:w="2965" w:type="dxa"/>
@@ -1948,12 +1861,6 @@
         </w:tc>
       </w:tr>
       <w:tr>
-        <w:tblPrEx>
-          <w:tblCellMar>
-            <w:top w:w="0" w:type="dxa"/>
-            <w:bottom w:w="0" w:type="dxa"/>
-          </w:tblCellMar>
-        </w:tblPrEx>
         <w:tc>
           <w:tcPr>
             <w:tcW w:w="2965" w:type="dxa"/>
@@ -2031,12 +1938,6 @@
         </w:tc>
       </w:tr>
       <w:tr>
-        <w:tblPrEx>
-          <w:tblCellMar>
-            <w:top w:w="0" w:type="dxa"/>
-            <w:bottom w:w="0" w:type="dxa"/>
-          </w:tblCellMar>
-        </w:tblPrEx>
         <w:tc>
           <w:tcPr>
             <w:tcW w:w="2965" w:type="dxa"/>
@@ -2158,12 +2059,6 @@
         </w:tc>
       </w:tr>
       <w:tr>
-        <w:tblPrEx>
-          <w:tblCellMar>
-            <w:top w:w="0" w:type="dxa"/>
-            <w:bottom w:w="0" w:type="dxa"/>
-          </w:tblCellMar>
-        </w:tblPrEx>
         <w:tc>
           <w:tcPr>
             <w:tcW w:w="2965" w:type="dxa"/>
@@ -2277,12 +2172,6 @@
         </w:tc>
       </w:tr>
       <w:tr>
-        <w:tblPrEx>
-          <w:tblCellMar>
-            <w:top w:w="0" w:type="dxa"/>
-            <w:bottom w:w="0" w:type="dxa"/>
-          </w:tblCellMar>
-        </w:tblPrEx>
         <w:tc>
           <w:tcPr>
             <w:tcW w:w="2965" w:type="dxa"/>
@@ -2360,12 +2249,6 @@
         </w:tc>
       </w:tr>
       <w:tr>
-        <w:tblPrEx>
-          <w:tblCellMar>
-            <w:top w:w="0" w:type="dxa"/>
-            <w:bottom w:w="0" w:type="dxa"/>
-          </w:tblCellMar>
-        </w:tblPrEx>
         <w:tc>
           <w:tcPr>
             <w:tcW w:w="2965" w:type="dxa"/>
@@ -2461,12 +2344,6 @@
         </w:tc>
       </w:tr>
       <w:tr>
-        <w:tblPrEx>
-          <w:tblCellMar>
-            <w:top w:w="0" w:type="dxa"/>
-            <w:bottom w:w="0" w:type="dxa"/>
-          </w:tblCellMar>
-        </w:tblPrEx>
         <w:tc>
           <w:tcPr>
             <w:tcW w:w="2965" w:type="dxa"/>
@@ -2537,12 +2414,6 @@
         </w:tc>
       </w:tr>
       <w:tr>
-        <w:tblPrEx>
-          <w:tblCellMar>
-            <w:top w:w="0" w:type="dxa"/>
-            <w:bottom w:w="0" w:type="dxa"/>
-          </w:tblCellMar>
-        </w:tblPrEx>
         <w:tc>
           <w:tcPr>
             <w:tcW w:w="2965" w:type="dxa"/>
@@ -2672,12 +2543,6 @@
         </w:tc>
       </w:tr>
       <w:tr>
-        <w:tblPrEx>
-          <w:tblCellMar>
-            <w:top w:w="0" w:type="dxa"/>
-            <w:bottom w:w="0" w:type="dxa"/>
-          </w:tblCellMar>
-        </w:tblPrEx>
         <w:tc>
           <w:tcPr>
             <w:tcW w:w="2965" w:type="dxa"/>
@@ -2747,12 +2612,6 @@
         </w:tc>
       </w:tr>
       <w:tr>
-        <w:tblPrEx>
-          <w:tblCellMar>
-            <w:top w:w="0" w:type="dxa"/>
-            <w:bottom w:w="0" w:type="dxa"/>
-          </w:tblCellMar>
-        </w:tblPrEx>
         <w:tc>
           <w:tcPr>
             <w:tcW w:w="2965" w:type="dxa"/>
@@ -2827,12 +2686,6 @@
         </w:tc>
       </w:tr>
       <w:tr>
-        <w:tblPrEx>
-          <w:tblCellMar>
-            <w:top w:w="0" w:type="dxa"/>
-            <w:bottom w:w="0" w:type="dxa"/>
-          </w:tblCellMar>
-        </w:tblPrEx>
         <w:tc>
           <w:tcPr>
             <w:tcW w:w="2965" w:type="dxa"/>
@@ -2921,12 +2774,6 @@
         </w:tc>
       </w:tr>
       <w:tr>
-        <w:tblPrEx>
-          <w:tblCellMar>
-            <w:top w:w="0" w:type="dxa"/>
-            <w:bottom w:w="0" w:type="dxa"/>
-          </w:tblCellMar>
-        </w:tblPrEx>
         <w:tc>
           <w:tcPr>
             <w:tcW w:w="2965" w:type="dxa"/>
@@ -2997,12 +2844,6 @@
         </w:tc>
       </w:tr>
       <w:tr>
-        <w:tblPrEx>
-          <w:tblCellMar>
-            <w:top w:w="0" w:type="dxa"/>
-            <w:bottom w:w="0" w:type="dxa"/>
-          </w:tblCellMar>
-        </w:tblPrEx>
         <w:tc>
           <w:tcPr>
             <w:tcW w:w="2965" w:type="dxa"/>
@@ -3072,12 +2913,6 @@
         </w:tc>
       </w:tr>
       <w:tr>
-        <w:tblPrEx>
-          <w:tblCellMar>
-            <w:top w:w="0" w:type="dxa"/>
-            <w:bottom w:w="0" w:type="dxa"/>
-          </w:tblCellMar>
-        </w:tblPrEx>
         <w:tc>
           <w:tcPr>
             <w:tcW w:w="2965" w:type="dxa"/>
@@ -3152,12 +2987,6 @@
         </w:tc>
       </w:tr>
       <w:tr>
-        <w:tblPrEx>
-          <w:tblCellMar>
-            <w:top w:w="0" w:type="dxa"/>
-            <w:bottom w:w="0" w:type="dxa"/>
-          </w:tblCellMar>
-        </w:tblPrEx>
         <w:tc>
           <w:tcPr>
             <w:tcW w:w="2965" w:type="dxa"/>
@@ -3227,12 +3056,6 @@
         </w:tc>
       </w:tr>
       <w:tr>
-        <w:tblPrEx>
-          <w:tblCellMar>
-            <w:top w:w="0" w:type="dxa"/>
-            <w:bottom w:w="0" w:type="dxa"/>
-          </w:tblCellMar>
-        </w:tblPrEx>
         <w:tc>
           <w:tcPr>
             <w:tcW w:w="2965" w:type="dxa"/>
@@ -3303,12 +3126,6 @@
         </w:tc>
       </w:tr>
       <w:tr>
-        <w:tblPrEx>
-          <w:tblCellMar>
-            <w:top w:w="0" w:type="dxa"/>
-            <w:bottom w:w="0" w:type="dxa"/>
-          </w:tblCellMar>
-        </w:tblPrEx>
         <w:tc>
           <w:tcPr>
             <w:tcW w:w="2965" w:type="dxa"/>
@@ -3383,12 +3200,6 @@
         </w:tc>
       </w:tr>
       <w:tr>
-        <w:tblPrEx>
-          <w:tblCellMar>
-            <w:top w:w="0" w:type="dxa"/>
-            <w:bottom w:w="0" w:type="dxa"/>
-          </w:tblCellMar>
-        </w:tblPrEx>
         <w:tc>
           <w:tcPr>
             <w:tcW w:w="2965" w:type="dxa"/>
@@ -3463,12 +3274,6 @@
         </w:tc>
       </w:tr>
       <w:tr>
-        <w:tblPrEx>
-          <w:tblCellMar>
-            <w:top w:w="0" w:type="dxa"/>
-            <w:bottom w:w="0" w:type="dxa"/>
-          </w:tblCellMar>
-        </w:tblPrEx>
         <w:tc>
           <w:tcPr>
             <w:tcW w:w="2965" w:type="dxa"/>
@@ -4156,12 +3961,6 @@
         <w:gridCol w:w="9858"/>
       </w:tblGrid>
       <w:tr>
-        <w:tblPrEx>
-          <w:tblCellMar>
-            <w:top w:w="0" w:type="dxa"/>
-            <w:bottom w:w="0" w:type="dxa"/>
-          </w:tblCellMar>
-        </w:tblPrEx>
         <w:trPr>
           <w:cantSplit/>
         </w:trPr>
@@ -4213,12 +4012,6 @@
         </w:tc>
       </w:tr>
       <w:tr>
-        <w:tblPrEx>
-          <w:tblCellMar>
-            <w:top w:w="0" w:type="dxa"/>
-            <w:bottom w:w="0" w:type="dxa"/>
-          </w:tblCellMar>
-        </w:tblPrEx>
         <w:trPr>
           <w:cantSplit/>
           <w:trHeight w:val="1300"/>
@@ -6715,8 +6508,6 @@
       <w:pPr>
         <w:spacing w:after="100"/>
       </w:pPr>
-      <w:bookmarkStart w:id="0" w:name="_GoBack"/>
-      <w:bookmarkEnd w:id="0"/>
     </w:p>
     <w:tbl>
       <w:tblPr>
@@ -6739,12 +6530,6 @@
         <w:gridCol w:w="9638"/>
       </w:tblGrid>
       <w:tr>
-        <w:tblPrEx>
-          <w:tblCellMar>
-            <w:top w:w="0" w:type="dxa"/>
-            <w:bottom w:w="0" w:type="dxa"/>
-          </w:tblCellMar>
-        </w:tblPrEx>
         <w:trPr>
           <w:cantSplit/>
         </w:trPr>
@@ -6780,12 +6565,6 @@
         </w:tc>
       </w:tr>
       <w:tr>
-        <w:tblPrEx>
-          <w:tblCellMar>
-            <w:top w:w="0" w:type="dxa"/>
-            <w:bottom w:w="0" w:type="dxa"/>
-          </w:tblCellMar>
-        </w:tblPrEx>
         <w:trPr>
           <w:cantSplit/>
           <w:trHeight w:val="1300"/>
@@ -6841,10 +6620,7 @@
       </w:pPr>
       <w:proofErr w:type="gramStart"/>
       <w:r>
-        <w:t>☐</w:t>
-      </w:r>
-      <w:r>
-        <w:t xml:space="preserve">  Completed</w:t>
+        <w:t>☐  Completed</w:t>
       </w:r>
       <w:proofErr w:type="gramEnd"/>
       <w:r>
@@ -6858,10 +6634,7 @@
       <w:proofErr w:type="gramStart"/>
       <w:r>
         <w:lastRenderedPageBreak/>
-        <w:t>☐</w:t>
-      </w:r>
-      <w:r>
-        <w:t xml:space="preserve">  Completed</w:t>
+        <w:t>☐  Completed</w:t>
       </w:r>
       <w:proofErr w:type="gramEnd"/>
       <w:r>
@@ -6874,10 +6647,7 @@
       </w:pPr>
       <w:proofErr w:type="gramStart"/>
       <w:r>
-        <w:t>☐</w:t>
-      </w:r>
-      <w:r>
-        <w:t xml:space="preserve">  Not</w:t>
+        <w:t>☐  Not</w:t>
       </w:r>
       <w:proofErr w:type="gramEnd"/>
       <w:r>
@@ -6932,12 +6702,6 @@
         <w:gridCol w:w="2138"/>
       </w:tblGrid>
       <w:tr>
-        <w:tblPrEx>
-          <w:tblCellMar>
-            <w:top w:w="0" w:type="dxa"/>
-            <w:bottom w:w="0" w:type="dxa"/>
-          </w:tblCellMar>
-        </w:tblPrEx>
         <w:trPr>
           <w:tblHeader/>
         </w:trPr>
@@ -7055,12 +6819,6 @@
         </w:tc>
       </w:tr>
       <w:tr>
-        <w:tblPrEx>
-          <w:tblCellMar>
-            <w:top w:w="0" w:type="dxa"/>
-            <w:bottom w:w="0" w:type="dxa"/>
-          </w:tblCellMar>
-        </w:tblPrEx>
         <w:tc>
           <w:tcPr>
             <w:tcW w:w="2700" w:type="dxa"/>
@@ -7171,12 +6929,6 @@
         </w:tc>
       </w:tr>
       <w:tr>
-        <w:tblPrEx>
-          <w:tblCellMar>
-            <w:top w:w="0" w:type="dxa"/>
-            <w:bottom w:w="0" w:type="dxa"/>
-          </w:tblCellMar>
-        </w:tblPrEx>
         <w:tc>
           <w:tcPr>
             <w:tcW w:w="2700" w:type="dxa"/>
@@ -7251,12 +7003,6 @@
         </w:tc>
       </w:tr>
       <w:tr>
-        <w:tblPrEx>
-          <w:tblCellMar>
-            <w:top w:w="0" w:type="dxa"/>
-            <w:bottom w:w="0" w:type="dxa"/>
-          </w:tblCellMar>
-        </w:tblPrEx>
         <w:tc>
           <w:tcPr>
             <w:tcW w:w="2700" w:type="dxa"/>
@@ -7379,12 +7125,6 @@
         <w:gridCol w:w="2238"/>
       </w:tblGrid>
       <w:tr>
-        <w:tblPrEx>
-          <w:tblCellMar>
-            <w:top w:w="0" w:type="dxa"/>
-            <w:bottom w:w="0" w:type="dxa"/>
-          </w:tblCellMar>
-        </w:tblPrEx>
         <w:trPr>
           <w:tblHeader/>
         </w:trPr>
@@ -7502,12 +7242,6 @@
         </w:tc>
       </w:tr>
       <w:tr>
-        <w:tblPrEx>
-          <w:tblCellMar>
-            <w:top w:w="0" w:type="dxa"/>
-            <w:bottom w:w="0" w:type="dxa"/>
-          </w:tblCellMar>
-        </w:tblPrEx>
         <w:tc>
           <w:tcPr>
             <w:tcW w:w="1600" w:type="dxa"/>
@@ -7618,12 +7352,6 @@
         </w:tc>
       </w:tr>
       <w:tr>
-        <w:tblPrEx>
-          <w:tblCellMar>
-            <w:top w:w="0" w:type="dxa"/>
-            <w:bottom w:w="0" w:type="dxa"/>
-          </w:tblCellMar>
-        </w:tblPrEx>
         <w:tc>
           <w:tcPr>
             <w:tcW w:w="1600" w:type="dxa"/>
@@ -7698,12 +7426,6 @@
         </w:tc>
       </w:tr>
       <w:tr>
-        <w:tblPrEx>
-          <w:tblCellMar>
-            <w:top w:w="0" w:type="dxa"/>
-            <w:bottom w:w="0" w:type="dxa"/>
-          </w:tblCellMar>
-        </w:tblPrEx>
         <w:tc>
           <w:tcPr>
             <w:tcW w:w="1600" w:type="dxa"/>
@@ -7801,10 +7523,7 @@
       </w:pPr>
       <w:proofErr w:type="gramStart"/>
       <w:r>
-        <w:t>☐</w:t>
-      </w:r>
-      <w:r>
-        <w:t xml:space="preserve">  I</w:t>
+        <w:t>☐  I</w:t>
       </w:r>
       <w:proofErr w:type="gramEnd"/>
       <w:r>
@@ -7817,10 +7536,7 @@
       </w:pPr>
       <w:proofErr w:type="gramStart"/>
       <w:r>
-        <w:t>☐</w:t>
-      </w:r>
-      <w:r>
-        <w:t xml:space="preserve">  No</w:t>
+        <w:t>☐  No</w:t>
       </w:r>
       <w:proofErr w:type="gramEnd"/>
       <w:r>
@@ -7854,10 +7570,7 @@
       </w:pPr>
       <w:proofErr w:type="gramStart"/>
       <w:r>
-        <w:t>☐</w:t>
-      </w:r>
-      <w:r>
-        <w:t xml:space="preserve">  Tested</w:t>
+        <w:t>☐  Tested</w:t>
       </w:r>
       <w:proofErr w:type="gramEnd"/>
       <w:r>
@@ -7898,12 +7611,6 @@
         <w:gridCol w:w="2438"/>
       </w:tblGrid>
       <w:tr>
-        <w:tblPrEx>
-          <w:tblCellMar>
-            <w:top w:w="0" w:type="dxa"/>
-            <w:bottom w:w="0" w:type="dxa"/>
-          </w:tblCellMar>
-        </w:tblPrEx>
         <w:trPr>
           <w:tblHeader/>
         </w:trPr>
@@ -7993,12 +7700,6 @@
         </w:tc>
       </w:tr>
       <w:tr>
-        <w:tblPrEx>
-          <w:tblCellMar>
-            <w:top w:w="0" w:type="dxa"/>
-            <w:bottom w:w="0" w:type="dxa"/>
-          </w:tblCellMar>
-        </w:tblPrEx>
         <w:tc>
           <w:tcPr>
             <w:tcW w:w="3600" w:type="dxa"/>
@@ -8025,13 +7726,7 @@
               <w:rPr>
                 <w:color w:val="7F7F7F"/>
               </w:rPr>
-              <w:t>Q1:</w:t>
-            </w:r>
-            <w:r>
-              <w:rPr>
-                <w:color w:val="7F7F7F"/>
-              </w:rPr>
-              <w:t xml:space="preserve"> </w:t>
+              <w:t xml:space="preserve">Q1: </w:t>
             </w:r>
             <w:r>
               <w:rPr>
@@ -8239,81 +7934,103 @@
                 <w:bCs/>
                 <w:color w:val="7F7F7F"/>
               </w:rPr>
-              <w:t>:</w:t>
-            </w:r>
-            <w:r>
-              <w:rPr>
-                <w:color w:val="7F7F7F"/>
-              </w:rPr>
-              <w:t xml:space="preserve"> </w:t>
-            </w:r>
-            <w:proofErr w:type="spellStart"/>
-            <w:r>
-              <w:t>Repaly</w:t>
-            </w:r>
-            <w:proofErr w:type="spellEnd"/>
-            <w:r>
-              <w:t xml:space="preserve"> all existing supplementary groups with </w:t>
-            </w:r>
-            <w:proofErr w:type="spellStart"/>
-            <w:r>
-              <w:t>labteam</w:t>
-            </w:r>
-            <w:proofErr w:type="spellEnd"/>
-          </w:p>
-          <w:p>
-            <w:proofErr w:type="spellStart"/>
+              <w:t xml:space="preserve"> user</w:t>
+            </w:r>
             <w:r>
               <w:rPr>
                 <w:b/>
                 <w:bCs/>
                 <w:color w:val="7F7F7F"/>
               </w:rPr>
-              <w:t>usermod</w:t>
+              <w:t>:</w:t>
+            </w:r>
+            <w:r>
+              <w:rPr>
+                <w:color w:val="7F7F7F"/>
+              </w:rPr>
+              <w:t xml:space="preserve"> </w:t>
+            </w:r>
+            <w:proofErr w:type="spellStart"/>
+            <w:r>
+              <w:t>Rep</w:t>
+            </w:r>
+            <w:r>
+              <w:t>a</w:t>
+            </w:r>
+            <w:r>
+              <w:t>ly</w:t>
             </w:r>
             <w:proofErr w:type="spellEnd"/>
+            <w:r>
+              <w:t xml:space="preserve"> all existing supplementary groups with </w:t>
+            </w:r>
+            <w:proofErr w:type="spellStart"/>
+            <w:r>
+              <w:t>labteam</w:t>
+            </w:r>
+            <w:proofErr w:type="spellEnd"/>
+          </w:p>
+          <w:p>
+            <w:proofErr w:type="spellStart"/>
             <w:r>
               <w:rPr>
                 <w:b/>
                 <w:bCs/>
                 <w:color w:val="7F7F7F"/>
               </w:rPr>
-              <w:t xml:space="preserve"> -</w:t>
-            </w:r>
-            <w:proofErr w:type="spellStart"/>
+              <w:t>usermod</w:t>
+            </w:r>
+            <w:proofErr w:type="spellEnd"/>
             <w:r>
               <w:rPr>
                 <w:b/>
                 <w:bCs/>
                 <w:color w:val="7F7F7F"/>
               </w:rPr>
-              <w:t>aG</w:t>
-            </w:r>
-            <w:proofErr w:type="spellEnd"/>
+              <w:t xml:space="preserve"> -</w:t>
+            </w:r>
+            <w:proofErr w:type="spellStart"/>
             <w:r>
               <w:rPr>
                 <w:b/>
                 <w:bCs/>
                 <w:color w:val="7F7F7F"/>
               </w:rPr>
-              <w:t xml:space="preserve"> </w:t>
-            </w:r>
-            <w:proofErr w:type="spellStart"/>
+              <w:t>aG</w:t>
+            </w:r>
+            <w:proofErr w:type="spellEnd"/>
             <w:r>
               <w:rPr>
                 <w:b/>
                 <w:bCs/>
                 <w:color w:val="7F7F7F"/>
               </w:rPr>
-              <w:t>labteam</w:t>
-            </w:r>
-            <w:proofErr w:type="spellEnd"/>
+              <w:t xml:space="preserve"> </w:t>
+            </w:r>
+            <w:proofErr w:type="spellStart"/>
             <w:r>
               <w:rPr>
                 <w:b/>
                 <w:bCs/>
                 <w:color w:val="7F7F7F"/>
               </w:rPr>
+              <w:t>labteam</w:t>
+            </w:r>
+            <w:proofErr w:type="spellEnd"/>
+            <w:r>
+              <w:rPr>
+                <w:b/>
+                <w:bCs/>
+                <w:color w:val="7F7F7F"/>
+              </w:rPr>
+              <w:t xml:space="preserve"> user</w:t>
+            </w:r>
+            <w:r>
+              <w:rPr>
+                <w:b/>
+                <w:bCs/>
+                <w:color w:val="7F7F7F"/>
+              </w:rPr>
               <w:t xml:space="preserve">: </w:t>
             </w:r>
             <w:r>
@@ -8358,12 +8075,6 @@
         </w:tc>
       </w:tr>
       <w:tr>
-        <w:tblPrEx>
-          <w:tblCellMar>
-            <w:top w:w="0" w:type="dxa"/>
-            <w:bottom w:w="0" w:type="dxa"/>
-          </w:tblCellMar>
-        </w:tblPrEx>
         <w:tc>
           <w:tcPr>
             <w:tcW w:w="3600" w:type="dxa"/>
@@ -8481,12 +8192,6 @@
         </w:tc>
       </w:tr>
       <w:tr>
-        <w:tblPrEx>
-          <w:tblCellMar>
-            <w:top w:w="0" w:type="dxa"/>
-            <w:bottom w:w="0" w:type="dxa"/>
-          </w:tblCellMar>
-        </w:tblPrEx>
         <w:tc>
           <w:tcPr>
             <w:tcW w:w="3600" w:type="dxa"/>
@@ -8506,10 +8211,7 @@
           <w:p>
             <w:r>
               <w:lastRenderedPageBreak/>
-              <w:t xml:space="preserve">Q3: when would you use kill -9, and </w:t>
-            </w:r>
-            <w:r>
-              <w:t>why shouldn’t it be your first choice?</w:t>
+              <w:t>Q3: when would you use kill -9, and why shouldn’t it be your first choice?</w:t>
             </w:r>
           </w:p>
         </w:tc>
@@ -8549,6 +8251,48 @@
             <w:r>
               <w:t xml:space="preserve"> the process cannot catch, block, or ignore this signal, it gives the application no time to clean up after itself.</w:t>
             </w:r>
+            <w:r>
+              <w:br/>
+            </w:r>
+            <w:r>
+              <w:rPr>
+                <w:b/>
+                <w:bCs/>
+              </w:rPr>
+              <w:t>The risks:</w:t>
+            </w:r>
+            <w:r>
+              <w:rPr>
+                <w:b/>
+                <w:bCs/>
+              </w:rPr>
+              <w:br/>
+            </w:r>
+            <w:r>
+              <w:t xml:space="preserve">1. </w:t>
+            </w:r>
+            <w:r>
+              <w:t xml:space="preserve">Unflushed data can </w:t>
+            </w:r>
+            <w:r>
+              <w:t xml:space="preserve">corrupt </w:t>
+            </w:r>
+            <w:proofErr w:type="spellStart"/>
+            <w:r>
+              <w:t>fils</w:t>
+            </w:r>
+            <w:proofErr w:type="spellEnd"/>
+            <w:r>
+              <w:t xml:space="preserve"> or database. </w:t>
+            </w:r>
+            <w:r>
+              <w:br/>
+              <w:t>2. Stale lock and PID files can block the next start.</w:t>
+            </w:r>
+            <w:r>
+              <w:br/>
+              <w:t>3. Child processes can be orphaned.</w:t>
+            </w:r>
           </w:p>
         </w:tc>
         <w:tc>
@@ -8571,12 +8315,6 @@
         </w:tc>
       </w:tr>
       <w:tr>
-        <w:tblPrEx>
-          <w:tblCellMar>
-            <w:top w:w="0" w:type="dxa"/>
-            <w:bottom w:w="0" w:type="dxa"/>
-          </w:tblCellMar>
-        </w:tblPrEx>
         <w:tc>
           <w:tcPr>
             <w:tcW w:w="3600" w:type="dxa"/>
@@ -8593,7 +8331,40 @@
               <w:right w:w="110" w:type="dxa"/>
             </w:tcMar>
           </w:tcPr>
-          <w:p/>
+          <w:p>
+            <w:r>
+              <w:rPr>
+                <w:rStyle w:val="Strong"/>
+              </w:rPr>
+              <w:t>Q4:</w:t>
+            </w:r>
+            <w:r>
+              <w:t xml:space="preserve"> the output of </w:t>
+            </w:r>
+            <w:r>
+              <w:rPr>
+                <w:rStyle w:val="HTMLCode"/>
+                <w:rFonts w:eastAsia="Arial"/>
+              </w:rPr>
+              <w:t xml:space="preserve">id </w:t>
+            </w:r>
+            <w:proofErr w:type="spellStart"/>
+            <w:r>
+              <w:rPr>
+                <w:rStyle w:val="HTMLCode"/>
+                <w:rFonts w:eastAsia="Arial"/>
+              </w:rPr>
+              <w:t>devops</w:t>
+            </w:r>
+            <w:proofErr w:type="spellEnd"/>
+            <w:r>
+              <w:rPr>
+                <w:rStyle w:val="HTMLCode"/>
+                <w:rFonts w:eastAsia="Arial"/>
+              </w:rPr>
+              <w:t>-lab</w:t>
+            </w:r>
+          </w:p>
         </w:tc>
         <w:tc>
           <w:tcPr>
@@ -8611,6 +8382,51 @@
               <w:right w:w="110" w:type="dxa"/>
             </w:tcMar>
           </w:tcPr>
+          <w:p>
+            <w:pPr>
+              <w:spacing w:after="80"/>
+            </w:pPr>
+            <w:proofErr w:type="spellStart"/>
+            <w:r>
+              <w:t>uid</w:t>
+            </w:r>
+            <w:proofErr w:type="spellEnd"/>
+            <w:r>
+              <w:t>=54322(</w:t>
+            </w:r>
+            <w:proofErr w:type="spellStart"/>
+            <w:r>
+              <w:t>devops</w:t>
+            </w:r>
+            <w:proofErr w:type="spellEnd"/>
+            <w:r>
+              <w:t xml:space="preserve">-lab) </w:t>
+            </w:r>
+            <w:proofErr w:type="spellStart"/>
+            <w:r>
+              <w:t>gid</w:t>
+            </w:r>
+            <w:proofErr w:type="spellEnd"/>
+            <w:r>
+              <w:t>=54333(</w:t>
+            </w:r>
+            <w:proofErr w:type="spellStart"/>
+            <w:r>
+              <w:t>devops</w:t>
+            </w:r>
+            <w:proofErr w:type="spellEnd"/>
+            <w:r>
+              <w:t>-lab) groups=54333(</w:t>
+            </w:r>
+            <w:proofErr w:type="spellStart"/>
+            <w:r>
+              <w:t>devops</w:t>
+            </w:r>
+            <w:proofErr w:type="spellEnd"/>
+            <w:r>
+              <w:t>-lab)</w:t>
+            </w:r>
+          </w:p>
           <w:p/>
         </w:tc>
         <w:tc>
@@ -8633,12 +8449,6 @@
         </w:tc>
       </w:tr>
       <w:tr>
-        <w:tblPrEx>
-          <w:tblCellMar>
-            <w:top w:w="0" w:type="dxa"/>
-            <w:bottom w:w="0" w:type="dxa"/>
-          </w:tblCellMar>
-        </w:tblPrEx>
         <w:tc>
           <w:tcPr>
             <w:tcW w:w="3600" w:type="dxa"/>
@@ -8655,7 +8465,47 @@
               <w:right w:w="110" w:type="dxa"/>
             </w:tcMar>
           </w:tcPr>
-          <w:p/>
+          <w:p>
+            <w:r>
+              <w:t xml:space="preserve">Your </w:t>
+            </w:r>
+            <w:r>
+              <w:rPr>
+                <w:rStyle w:val="HTMLCode"/>
+                <w:rFonts w:eastAsia="Arial"/>
+              </w:rPr>
+              <w:t>git log --</w:t>
+            </w:r>
+            <w:proofErr w:type="spellStart"/>
+            <w:r>
+              <w:rPr>
+                <w:rStyle w:val="HTMLCode"/>
+                <w:rFonts w:eastAsia="Arial"/>
+              </w:rPr>
+              <w:t>oneline</w:t>
+            </w:r>
+            <w:proofErr w:type="spellEnd"/>
+            <w:r>
+              <w:rPr>
+                <w:rStyle w:val="HTMLCode"/>
+                <w:rFonts w:eastAsia="Arial"/>
+              </w:rPr>
+              <w:t xml:space="preserve"> -2</w:t>
+            </w:r>
+            <w:r>
+              <w:t xml:space="preserve">, confirming the </w:t>
+            </w:r>
+            <w:r>
+              <w:rPr>
+                <w:rStyle w:val="HTMLCode"/>
+                <w:rFonts w:eastAsia="Arial"/>
+              </w:rPr>
+              <w:t>day02</w:t>
+            </w:r>
+            <w:r>
+              <w:t xml:space="preserve"> push</w:t>
+            </w:r>
+          </w:p>
         </w:tc>
         <w:tc>
           <w:tcPr>
@@ -8673,6 +8523,30 @@
               <w:right w:w="110" w:type="dxa"/>
             </w:tcMar>
           </w:tcPr>
+          <w:p>
+            <w:pPr>
+              <w:spacing w:after="80"/>
+            </w:pPr>
+            <w:r>
+              <w:t>c25834d (HEAD -&gt; main, origin/main) docs: add day02 users, groups, and processes</w:t>
+            </w:r>
+          </w:p>
+          <w:p>
+            <w:pPr>
+              <w:spacing w:after="80"/>
+            </w:pPr>
+            <w:r>
+              <w:t xml:space="preserve">4edc310 docs: add day01 know system </w:t>
+            </w:r>
+            <w:proofErr w:type="gramStart"/>
+            <w:r>
+              <w:t>The</w:t>
+            </w:r>
+            <w:proofErr w:type="gramEnd"/>
+            <w:r>
+              <w:t xml:space="preserve"> filesystem map permissions</w:t>
+            </w:r>
+          </w:p>
           <w:p/>
         </w:tc>
         <w:tc>
@@ -8695,12 +8569,6 @@
         </w:tc>
       </w:tr>
       <w:tr>
-        <w:tblPrEx>
-          <w:tblCellMar>
-            <w:top w:w="0" w:type="dxa"/>
-            <w:bottom w:w="0" w:type="dxa"/>
-          </w:tblCellMar>
-        </w:tblPrEx>
         <w:tc>
           <w:tcPr>
             <w:tcW w:w="3600" w:type="dxa"/>
@@ -8717,24 +8585,58 @@
               <w:right w:w="110" w:type="dxa"/>
             </w:tcMar>
           </w:tcPr>
+          <w:p>
+            <w:r>
+              <w:t>top 3 memory-using processes</w:t>
+            </w:r>
+          </w:p>
+        </w:tc>
+        <w:tc>
+          <w:tcPr>
+            <w:tcW w:w="3600" w:type="dxa"/>
+            <w:tcBorders>
+              <w:top w:val="single" w:sz="4" w:space="0" w:color="A6A6A6"/>
+              <w:left w:val="single" w:sz="4" w:space="0" w:color="A6A6A6"/>
+              <w:bottom w:val="single" w:sz="4" w:space="0" w:color="A6A6A6"/>
+              <w:right w:val="single" w:sz="4" w:space="0" w:color="A6A6A6"/>
+            </w:tcBorders>
+            <w:tcMar>
+              <w:top w:w="70" w:type="dxa"/>
+              <w:left w:w="110" w:type="dxa"/>
+              <w:bottom w:w="70" w:type="dxa"/>
+              <w:right w:w="110" w:type="dxa"/>
+            </w:tcMar>
+          </w:tcPr>
+          <w:p>
+            <w:pPr>
+              <w:spacing w:after="80"/>
+              <w:rPr>
+                <w:rFonts w:ascii="Courier New" w:eastAsia="Times New Roman" w:hAnsi="Courier New" w:cs="Courier New"/>
+                <w:sz w:val="20"/>
+                <w:szCs w:val="20"/>
+              </w:rPr>
+            </w:pPr>
+            <w:proofErr w:type="spellStart"/>
+            <w:r>
+              <w:rPr>
+                <w:rFonts w:ascii="Courier New" w:eastAsia="Times New Roman" w:hAnsi="Courier New" w:cs="Courier New"/>
+                <w:sz w:val="20"/>
+                <w:szCs w:val="20"/>
+              </w:rPr>
+              <w:t>ps</w:t>
+            </w:r>
+            <w:proofErr w:type="spellEnd"/>
+            <w:r>
+              <w:rPr>
+                <w:rFonts w:ascii="Courier New" w:eastAsia="Times New Roman" w:hAnsi="Courier New" w:cs="Courier New"/>
+                <w:sz w:val="20"/>
+                <w:szCs w:val="20"/>
+              </w:rPr>
+              <w:t xml:space="preserve"> aux --sort=-%mem | head -4</w:t>
+            </w:r>
+          </w:p>
           <w:p/>
-        </w:tc>
-        <w:tc>
-          <w:tcPr>
-            <w:tcW w:w="3600" w:type="dxa"/>
-            <w:tcBorders>
-              <w:top w:val="single" w:sz="4" w:space="0" w:color="A6A6A6"/>
-              <w:left w:val="single" w:sz="4" w:space="0" w:color="A6A6A6"/>
-              <w:bottom w:val="single" w:sz="4" w:space="0" w:color="A6A6A6"/>
-              <w:right w:val="single" w:sz="4" w:space="0" w:color="A6A6A6"/>
-            </w:tcBorders>
-            <w:tcMar>
-              <w:top w:w="70" w:type="dxa"/>
-              <w:left w:w="110" w:type="dxa"/>
-              <w:bottom w:w="70" w:type="dxa"/>
-              <w:right w:w="110" w:type="dxa"/>
-            </w:tcMar>
-          </w:tcPr>
+          <w:p/>
           <w:p/>
         </w:tc>
         <w:tc>
@@ -8757,6 +8659,24 @@
         </w:tc>
       </w:tr>
     </w:tbl>
+    <w:p>
+      <w:pPr>
+        <w:pStyle w:val="Heading1"/>
+        <w:pBdr>
+          <w:bottom w:val="single" w:sz="8" w:space="2" w:color="1F4E79"/>
+        </w:pBdr>
+      </w:pPr>
+      <w:bookmarkStart w:id="0" w:name="_GoBack"/>
+      <w:bookmarkEnd w:id="0"/>
+    </w:p>
+    <w:p>
+      <w:pPr>
+        <w:pStyle w:val="Heading1"/>
+        <w:pBdr>
+          <w:bottom w:val="single" w:sz="8" w:space="2" w:color="1F4E79"/>
+        </w:pBdr>
+      </w:pPr>
+    </w:p>
     <w:p>
       <w:pPr>
         <w:pStyle w:val="Heading1"/>
@@ -8790,12 +8710,6 @@
         <w:gridCol w:w="7038"/>
       </w:tblGrid>
       <w:tr>
-        <w:tblPrEx>
-          <w:tblCellMar>
-            <w:top w:w="0" w:type="dxa"/>
-            <w:bottom w:w="0" w:type="dxa"/>
-          </w:tblCellMar>
-        </w:tblPrEx>
         <w:tc>
           <w:tcPr>
             <w:tcW w:w="2600" w:type="dxa"/>
@@ -8840,22 +8754,18 @@
             </w:tcMar>
           </w:tcPr>
           <w:p>
-            <w:r>
-              <w:rPr>
-                <w:color w:val="7F7F7F"/>
-              </w:rPr>
-              <w:t>https://github.com/&lt;username&gt;/devops-refresher</w:t>
-            </w:r>
+            <w:hyperlink r:id="rId8" w:history="1">
+              <w:r>
+                <w:rPr>
+                  <w:rStyle w:val="Hyperlink"/>
+                </w:rPr>
+                <w:t>https://github.com/&lt;username&gt;/devops-refresher</w:t>
+              </w:r>
+            </w:hyperlink>
           </w:p>
         </w:tc>
       </w:tr>
       <w:tr>
-        <w:tblPrEx>
-          <w:tblCellMar>
-            <w:top w:w="0" w:type="dxa"/>
-            <w:bottom w:w="0" w:type="dxa"/>
-          </w:tblCellMar>
-        </w:tblPrEx>
         <w:tc>
           <w:tcPr>
             <w:tcW w:w="2600" w:type="dxa"/>
@@ -8910,12 +8820,6 @@
         </w:tc>
       </w:tr>
       <w:tr>
-        <w:tblPrEx>
-          <w:tblCellMar>
-            <w:top w:w="0" w:type="dxa"/>
-            <w:bottom w:w="0" w:type="dxa"/>
-          </w:tblCellMar>
-        </w:tblPrEx>
         <w:tc>
           <w:tcPr>
             <w:tcW w:w="2600" w:type="dxa"/>
@@ -8970,12 +8874,6 @@
         </w:tc>
       </w:tr>
       <w:tr>
-        <w:tblPrEx>
-          <w:tblCellMar>
-            <w:top w:w="0" w:type="dxa"/>
-            <w:bottom w:w="0" w:type="dxa"/>
-          </w:tblCellMar>
-        </w:tblPrEx>
         <w:tc>
           <w:tcPr>
             <w:tcW w:w="2600" w:type="dxa"/>
@@ -9030,12 +8928,6 @@
         </w:tc>
       </w:tr>
       <w:tr>
-        <w:tblPrEx>
-          <w:tblCellMar>
-            <w:top w:w="0" w:type="dxa"/>
-            <w:bottom w:w="0" w:type="dxa"/>
-          </w:tblCellMar>
-        </w:tblPrEx>
         <w:tc>
           <w:tcPr>
             <w:tcW w:w="2600" w:type="dxa"/>
@@ -9104,12 +8996,6 @@
         </w:tc>
       </w:tr>
       <w:tr>
-        <w:tblPrEx>
-          <w:tblCellMar>
-            <w:top w:w="0" w:type="dxa"/>
-            <w:bottom w:w="0" w:type="dxa"/>
-          </w:tblCellMar>
-        </w:tblPrEx>
         <w:tc>
           <w:tcPr>
             <w:tcW w:w="2600" w:type="dxa"/>
@@ -9158,13 +9044,7 @@
               <w:rPr>
                 <w:color w:val="7F7F7F"/>
               </w:rPr>
-              <w:t>☐</w:t>
-            </w:r>
-            <w:r>
-              <w:rPr>
-                <w:color w:val="7F7F7F"/>
-              </w:rPr>
-              <w:t xml:space="preserve"> Yes    ☐ No</w:t>
+              <w:t>☐ Yes    ☐ No</w:t>
             </w:r>
           </w:p>
         </w:tc>
@@ -9196,12 +9076,6 @@
         <w:gridCol w:w="9638"/>
       </w:tblGrid>
       <w:tr>
-        <w:tblPrEx>
-          <w:tblCellMar>
-            <w:top w:w="0" w:type="dxa"/>
-            <w:bottom w:w="0" w:type="dxa"/>
-          </w:tblCellMar>
-        </w:tblPrEx>
         <w:trPr>
           <w:cantSplit/>
         </w:trPr>
@@ -9231,18 +9105,13 @@
                 <w:b/>
                 <w:bCs/>
               </w:rPr>
+              <w:lastRenderedPageBreak/>
               <w:t>Git commands used today</w:t>
             </w:r>
           </w:p>
         </w:tc>
       </w:tr>
       <w:tr>
-        <w:tblPrEx>
-          <w:tblCellMar>
-            <w:top w:w="0" w:type="dxa"/>
-            <w:bottom w:w="0" w:type="dxa"/>
-          </w:tblCellMar>
-        </w:tblPrEx>
         <w:trPr>
           <w:cantSplit/>
           <w:trHeight w:val="1300"/>
@@ -9300,6 +9169,59 @@
                 <w:color w:val="7F7F7F"/>
               </w:rPr>
               <w:t xml:space="preserve">   git push</w:t>
+            </w:r>
+            <w:r>
+              <w:rPr>
+                <w:rFonts w:ascii="Consolas" w:eastAsia="Consolas" w:hAnsi="Consolas" w:cs="Consolas"/>
+                <w:color w:val="7F7F7F"/>
+              </w:rPr>
+              <w:br/>
+            </w:r>
+            <w:r>
+              <w:rPr>
+                <w:rFonts w:ascii="Consolas" w:eastAsia="Consolas" w:hAnsi="Consolas" w:cs="Consolas"/>
+                <w:color w:val="7F7F7F"/>
+              </w:rPr>
+              <w:br/>
+            </w:r>
+            <w:r>
+              <w:t xml:space="preserve">our </w:t>
+            </w:r>
+            <w:r>
+              <w:rPr>
+                <w:rStyle w:val="HTMLCode"/>
+                <w:rFonts w:eastAsia="Arial"/>
+              </w:rPr>
+              <w:t>git log --</w:t>
+            </w:r>
+            <w:proofErr w:type="spellStart"/>
+            <w:r>
+              <w:rPr>
+                <w:rStyle w:val="HTMLCode"/>
+                <w:rFonts w:eastAsia="Arial"/>
+              </w:rPr>
+              <w:t>oneline</w:t>
+            </w:r>
+            <w:proofErr w:type="spellEnd"/>
+            <w:r>
+              <w:rPr>
+                <w:rStyle w:val="HTMLCode"/>
+                <w:rFonts w:eastAsia="Arial"/>
+              </w:rPr>
+              <w:t xml:space="preserve"> -2</w:t>
+            </w:r>
+            <w:r>
+              <w:t xml:space="preserve">, confirming the </w:t>
+            </w:r>
+            <w:r>
+              <w:rPr>
+                <w:rStyle w:val="HTMLCode"/>
+                <w:rFonts w:eastAsia="Arial"/>
+              </w:rPr>
+              <w:t>day02</w:t>
+            </w:r>
+            <w:r>
+              <w:t xml:space="preserve"> push</w:t>
             </w:r>
           </w:p>
         </w:tc>
@@ -9338,12 +9260,6 @@
         <w:gridCol w:w="6438"/>
       </w:tblGrid>
       <w:tr>
-        <w:tblPrEx>
-          <w:tblCellMar>
-            <w:top w:w="0" w:type="dxa"/>
-            <w:bottom w:w="0" w:type="dxa"/>
-          </w:tblCellMar>
-        </w:tblPrEx>
         <w:trPr>
           <w:tblHeader/>
         </w:trPr>
@@ -9405,12 +9321,6 @@
         </w:tc>
       </w:tr>
       <w:tr>
-        <w:tblPrEx>
-          <w:tblCellMar>
-            <w:top w:w="0" w:type="dxa"/>
-            <w:bottom w:w="0" w:type="dxa"/>
-          </w:tblCellMar>
-        </w:tblPrEx>
         <w:tc>
           <w:tcPr>
             <w:tcW w:w="3200" w:type="dxa"/>
@@ -9456,12 +9366,6 @@
         </w:tc>
       </w:tr>
       <w:tr>
-        <w:tblPrEx>
-          <w:tblCellMar>
-            <w:top w:w="0" w:type="dxa"/>
-            <w:bottom w:w="0" w:type="dxa"/>
-          </w:tblCellMar>
-        </w:tblPrEx>
         <w:tc>
           <w:tcPr>
             <w:tcW w:w="3200" w:type="dxa"/>
@@ -9500,12 +9404,6 @@
         </w:tc>
       </w:tr>
       <w:tr>
-        <w:tblPrEx>
-          <w:tblCellMar>
-            <w:top w:w="0" w:type="dxa"/>
-            <w:bottom w:w="0" w:type="dxa"/>
-          </w:tblCellMar>
-        </w:tblPrEx>
         <w:tc>
           <w:tcPr>
             <w:tcW w:w="3200" w:type="dxa"/>
@@ -9544,12 +9442,6 @@
         </w:tc>
       </w:tr>
       <w:tr>
-        <w:tblPrEx>
-          <w:tblCellMar>
-            <w:top w:w="0" w:type="dxa"/>
-            <w:bottom w:w="0" w:type="dxa"/>
-          </w:tblCellMar>
-        </w:tblPrEx>
         <w:tc>
           <w:tcPr>
             <w:tcW w:w="3200" w:type="dxa"/>
@@ -9619,9 +9511,39 @@
         <w:t>Next lesson: ______________________________</w:t>
       </w:r>
     </w:p>
+    <w:p>
+      <w:pPr>
+        <w:spacing w:after="80"/>
+      </w:pPr>
+    </w:p>
+    <w:p>
+      <w:pPr>
+        <w:spacing w:after="80"/>
+      </w:pPr>
+    </w:p>
+    <w:p>
+      <w:pPr>
+        <w:spacing w:after="80"/>
+      </w:pPr>
+    </w:p>
+    <w:p>
+      <w:pPr>
+        <w:spacing w:after="80"/>
+      </w:pPr>
+    </w:p>
+    <w:p>
+      <w:pPr>
+        <w:spacing w:after="80"/>
+      </w:pPr>
+    </w:p>
+    <w:p>
+      <w:pPr>
+        <w:spacing w:after="80"/>
+      </w:pPr>
+    </w:p>
     <w:sectPr>
-      <w:headerReference w:type="default" r:id="rId8"/>
-      <w:footerReference w:type="default" r:id="rId9"/>
+      <w:headerReference w:type="default" r:id="rId9"/>
+      <w:footerReference w:type="default" r:id="rId10"/>
       <w:pgSz w:w="11906" w:h="16838"/>
       <w:pgMar w:top="1134" w:right="1134" w:bottom="1134" w:left="1134" w:header="708" w:footer="708" w:gutter="0"/>
       <w:cols w:space="720"/>
@@ -11532,6 +11454,119 @@
       </w:pPr>
     </w:lvl>
   </w:abstractNum>
+  <w:abstractNum w:abstractNumId="14" w15:restartNumberingAfterBreak="0">
+    <w:nsid w:val="7C2447EC"/>
+    <w:multiLevelType w:val="hybridMultilevel"/>
+    <w:tmpl w:val="E56E6E6C"/>
+    <w:lvl w:ilvl="0" w:tplc="04090001">
+      <w:start w:val="1"/>
+      <w:numFmt w:val="bullet"/>
+      <w:lvlText w:val=""/>
+      <w:lvlJc w:val="left"/>
+      <w:pPr>
+        <w:ind w:left="720" w:hanging="360"/>
+      </w:pPr>
+      <w:rPr>
+        <w:rFonts w:ascii="Symbol" w:hAnsi="Symbol" w:hint="default"/>
+      </w:rPr>
+    </w:lvl>
+    <w:lvl w:ilvl="1" w:tplc="04090003" w:tentative="1">
+      <w:start w:val="1"/>
+      <w:numFmt w:val="bullet"/>
+      <w:lvlText w:val="o"/>
+      <w:lvlJc w:val="left"/>
+      <w:pPr>
+        <w:ind w:left="1440" w:hanging="360"/>
+      </w:pPr>
+      <w:rPr>
+        <w:rFonts w:ascii="Courier New" w:hAnsi="Courier New" w:cs="Courier New" w:hint="default"/>
+      </w:rPr>
+    </w:lvl>
+    <w:lvl w:ilvl="2" w:tplc="04090005" w:tentative="1">
+      <w:start w:val="1"/>
+      <w:numFmt w:val="bullet"/>
+      <w:lvlText w:val=""/>
+      <w:lvlJc w:val="left"/>
+      <w:pPr>
+        <w:ind w:left="2160" w:hanging="360"/>
+      </w:pPr>
+      <w:rPr>
+        <w:rFonts w:ascii="Wingdings" w:hAnsi="Wingdings" w:hint="default"/>
+      </w:rPr>
+    </w:lvl>
+    <w:lvl w:ilvl="3" w:tplc="04090001" w:tentative="1">
+      <w:start w:val="1"/>
+      <w:numFmt w:val="bullet"/>
+      <w:lvlText w:val=""/>
+      <w:lvlJc w:val="left"/>
+      <w:pPr>
+        <w:ind w:left="2880" w:hanging="360"/>
+      </w:pPr>
+      <w:rPr>
+        <w:rFonts w:ascii="Symbol" w:hAnsi="Symbol" w:hint="default"/>
+      </w:rPr>
+    </w:lvl>
+    <w:lvl w:ilvl="4" w:tplc="04090003" w:tentative="1">
+      <w:start w:val="1"/>
+      <w:numFmt w:val="bullet"/>
+      <w:lvlText w:val="o"/>
+      <w:lvlJc w:val="left"/>
+      <w:pPr>
+        <w:ind w:left="3600" w:hanging="360"/>
+      </w:pPr>
+      <w:rPr>
+        <w:rFonts w:ascii="Courier New" w:hAnsi="Courier New" w:cs="Courier New" w:hint="default"/>
+      </w:rPr>
+    </w:lvl>
+    <w:lvl w:ilvl="5" w:tplc="04090005" w:tentative="1">
+      <w:start w:val="1"/>
+      <w:numFmt w:val="bullet"/>
+      <w:lvlText w:val=""/>
+      <w:lvlJc w:val="left"/>
+      <w:pPr>
+        <w:ind w:left="4320" w:hanging="360"/>
+      </w:pPr>
+      <w:rPr>
+        <w:rFonts w:ascii="Wingdings" w:hAnsi="Wingdings" w:hint="default"/>
+      </w:rPr>
+    </w:lvl>
+    <w:lvl w:ilvl="6" w:tplc="04090001" w:tentative="1">
+      <w:start w:val="1"/>
+      <w:numFmt w:val="bullet"/>
+      <w:lvlText w:val=""/>
+      <w:lvlJc w:val="left"/>
+      <w:pPr>
+        <w:ind w:left="5040" w:hanging="360"/>
+      </w:pPr>
+      <w:rPr>
+        <w:rFonts w:ascii="Symbol" w:hAnsi="Symbol" w:hint="default"/>
+      </w:rPr>
+    </w:lvl>
+    <w:lvl w:ilvl="7" w:tplc="04090003" w:tentative="1">
+      <w:start w:val="1"/>
+      <w:numFmt w:val="bullet"/>
+      <w:lvlText w:val="o"/>
+      <w:lvlJc w:val="left"/>
+      <w:pPr>
+        <w:ind w:left="5760" w:hanging="360"/>
+      </w:pPr>
+      <w:rPr>
+        <w:rFonts w:ascii="Courier New" w:hAnsi="Courier New" w:cs="Courier New" w:hint="default"/>
+      </w:rPr>
+    </w:lvl>
+    <w:lvl w:ilvl="8" w:tplc="04090005" w:tentative="1">
+      <w:start w:val="1"/>
+      <w:numFmt w:val="bullet"/>
+      <w:lvlText w:val=""/>
+      <w:lvlJc w:val="left"/>
+      <w:pPr>
+        <w:ind w:left="6480" w:hanging="360"/>
+      </w:pPr>
+      <w:rPr>
+        <w:rFonts w:ascii="Wingdings" w:hAnsi="Wingdings" w:hint="default"/>
+      </w:rPr>
+    </w:lvl>
+  </w:abstractNum>
   <w:num w:numId="1">
     <w:abstractNumId w:val="8"/>
     <w:lvlOverride w:ilvl="0">
@@ -11579,6 +11614,9 @@
   </w:num>
   <w:num w:numId="14">
     <w:abstractNumId w:val="6"/>
+  </w:num>
+  <w:num w:numId="15">
+    <w:abstractNumId w:val="14"/>
   </w:num>
 </w:numbering>
 </file>
@@ -12327,6 +12365,18 @@
     <w:basedOn w:val="DefaultParagraphFont"/>
     <w:rsid w:val="00365E7E"/>
   </w:style>
+  <w:style w:type="character" w:styleId="UnresolvedMention">
+    <w:name w:val="Unresolved Mention"/>
+    <w:basedOn w:val="DefaultParagraphFont"/>
+    <w:uiPriority w:val="99"/>
+    <w:semiHidden/>
+    <w:unhideWhenUsed/>
+    <w:rsid w:val="00C068D1"/>
+    <w:rPr>
+      <w:color w:val="605E5C"/>
+      <w:shd w:val="clear" w:color="auto" w:fill="E1DFDD"/>
+    </w:rPr>
+  </w:style>
 </w:styles>
 </file>
 

</xml_diff>